<commit_message>
phase7 final: regenerate docs/pdf docx_pptx assets, commit prior uncommitted engine/sidecar/mode_s updates, test counts 108+21=129
</commit_message>
<xml_diff>
--- a/docs/docx_pptx/AeroPulse-NG_Executive_Summary.docx
+++ b/docs/docx_pptx/AeroPulse-NG_Executive_Summary.docx
@@ -373,7 +373,7 @@
     </w:p>
     <w:p>
       <w:r>
-        <w:t>A Rust/Tauri backend demodulates 1090 MHz Mode S ADS-B, resolving positions through Compact Position Reporting; a six-state Extended Kalman Filter smooths jitter and dead-reckons tracks through 30-second RF dropouts. An R*-tree spatial index drives continuous Short-Term Conflict Alerting against ICAO Doc 4444 separation minima (rendered 9.26 km / 305 m) within a 120-second lookahead. A triple-fusion weather matrix merges AWOS serial telemetry, ACARS D-ATIS broadcasts and Mode S BDS 4,4/4,5 downlinks into an offline 3D wind/temperature model tuned for harmattan operations. Defence overlays flag dark targets, squawk emergencies and geofence incursions, and compute intercept geometry. A hardware-accelerated display layer renders HF-STD-010A-compliant screens across dual operator monitors, in SI metric units per NCAA / ICAO Annex 5 policy.</w:t>
+        <w:t>A Rust/Tauri backend demodulates 1090 MHz Mode S ADS-B, resolving positions through Compact Position Reporting; a six-state Kalman filter (constant-velocity, linear; module ekf.rs historic) smooths jitter and dead-reckons tracks through 30-second RF dropouts. An R*-tree spatial index drives continuous Short-Term Conflict Alerting against ICAO Doc 4444 separation minima (rendered 9.26 km / 305 m) within a 120-second lookahead. A triple-fusion weather matrix merges AWOS serial telemetry, ACARS D-ATIS broadcasts and Mode S BDS 4,4/4,5 downlinks into an offline 3D wind/temperature model tuned for harmattan operations. Defence overlays flag dark targets, squawk emergencies and geofence incursions, and compute intercept geometry. A hardware-accelerated display layer renders HF-STD-010A-compliant screens across dual operator monitors, in SI metric units per NCAA / ICAO Annex 5 policy.</w:t>
       </w:r>
     </w:p>
     <w:p>
@@ -557,7 +557,7 @@
                 <w:color w:val="1E2630"/>
                 <w:sz w:val="17"/>
               </w:rPr>
-              <w:t>90 tests passed</w:t>
+              <w:t>108 tests passed</w:t>
             </w:r>
           </w:p>
         </w:tc>
@@ -583,7 +583,7 @@
                 <w:color w:val="1E2630"/>
                 <w:sz w:val="17"/>
               </w:rPr>
-              <w:t>Decoder, CPR, EKF, R*-tree, STCA and engine integration</w:t>
+              <w:t>Decoder, CPR, Kalman filter, R*-tree, STCA and engine integration</w:t>
             </w:r>
           </w:p>
         </w:tc>
@@ -637,7 +637,7 @@
                 <w:color w:val="1E2630"/>
                 <w:sz w:val="17"/>
               </w:rPr>
-              <w:t>14 tests passed</w:t>
+              <w:t>21 tests passed</w:t>
             </w:r>
           </w:p>
         </w:tc>

</xml_diff>